<commit_message>
Report: lab environment (Python 3.12), lab results and screenshots
</commit_message>
<xml_diff>
--- a/reports/Heart_Disease_MLOps_Report.docx
+++ b/reports/Heart_Disease_MLOps_Report.docx
@@ -263,7 +263,13 @@
                 <w:color w:val="9B2C2C"/>
                 <w:sz w:val="18"/>
               </w:rPr>
-              <w:t>python3.11 -m venv .venv &amp;&amp; source .venv/bin/activate</w:t>
+              <w:t>python3 -m venv .venv &amp;&amp; source .venv/bin/activate</w:t>
+            </w:r>
+            <w:r>
+              <w:rPr>
+                <w:sz w:val="18"/>
+              </w:rPr>
+              <w:t xml:space="preserve"> (Python 3.11 or 3.12)</w:t>
             </w:r>
           </w:p>
         </w:tc>
@@ -624,6 +630,17 @@
       </w:r>
       <w:r>
         <w:t xml:space="preserve"> (adds pytest, flake8, Jupyter).</w:t>
+      </w:r>
+    </w:p>
+    <w:p>
+      <w:r>
+        <w:rPr>
+          <w:b/>
+        </w:rPr>
+        <w:t>Execution environment.</w:t>
+      </w:r>
+      <w:r>
+        <w:t xml:space="preserve"> The pipeline was executed end-to-end in the BITS lab: Linux (x86_64, 4 vCPU, 15 GB RAM), Python 3.12.9, Docker 28.0.1, Minikube v1.35.0 (docker driver), kubectl v1.31.1. The Docker image and the GitHub Actions jobs use Python 3.11; the code and pinned dependencies are tested on both 3.11 and 3.12.</w:t>
       </w:r>
     </w:p>
     <w:p>

</xml_diff>

<commit_message>
updated the video link and generated the pdf
</commit_message>
<xml_diff>
--- a/reports/Heart_Disease_MLOps_Report.docx
+++ b/reports/Heart_Disease_MLOps_Report.docx
@@ -55,6 +55,9 @@
     <w:p>
       <w:pPr>
         <w:jc w:val="center"/>
+        <w:rPr>
+          <w:color w:val="1D4E89"/>
+        </w:rPr>
       </w:pPr>
       <w:r>
         <w:rPr>
@@ -65,12 +68,38 @@
       <w:r>
         <w:t xml:space="preserve"> </w:t>
       </w:r>
-      <w:r>
+      <w:hyperlink r:id="rId8" w:history="1">
+        <w:r>
+          <w:rPr>
+            <w:rStyle w:val="Hyperlink"/>
+          </w:rPr>
+          <w:t>https://github.com/TilakMtech/heart-mlops</w:t>
+        </w:r>
+      </w:hyperlink>
+    </w:p>
+    <w:p>
+      <w:pPr>
+        <w:ind w:left="1440" w:firstLine="720"/>
         <w:rPr>
-          <w:color w:val="1D4E89"/>
+          <w:rFonts w:ascii="Times New Roman" w:eastAsia="Times New Roman" w:hAnsi="Times New Roman" w:cs="Times New Roman"/>
+          <w:sz w:val="24"/>
+          <w:szCs w:val="24"/>
         </w:rPr>
-        <w:t>https://github.com/TilakMtech/heart-mlops</w:t>
-      </w:r>
+      </w:pPr>
+      <w:r>
+        <w:t xml:space="preserve">  </w:t>
+      </w:r>
+      <w:r>
+        <w:t xml:space="preserve">Demo video: </w:t>
+      </w:r>
+      <w:hyperlink r:id="rId9" w:tooltip="Original URL:&#10;https://protect.checkpoint.com/v2/r01/___https://drive.google.com/drive/folders/1_9y0KQ9w0-fGpS1RQlmcoIgg9FUK5-L7___.YzJ1OmV2b2tldGVjaG5vbG9naWVzMTpjOm86M2Y2NTc3OGNhYzQ2ZmY4Mzg5YmNjYjBiNjNkZDQ2MWQ6Nzo5OGE0OmExNGVhYTZjMDc2ZTZkYmZhNDJjZTA5NDQ3ZGJhNjJlYWI3NmNiZGYwMzRiNjhjOWQ4NjY5MGIxZGE4NDI5M2M6aDpUOkY&#10;&#10;Click to follow link." w:history="1">
+        <w:r>
+          <w:rPr>
+            <w:rStyle w:val="Hyperlink"/>
+          </w:rPr>
+          <w:t>3rd_sem_MLOps - Google Drive</w:t>
+        </w:r>
+      </w:hyperlink>
     </w:p>
     <w:p>
       <w:pPr>
@@ -83,10 +112,7 @@
         <w:t>Date:</w:t>
       </w:r>
       <w:r>
-        <w:t xml:space="preserve"> October </w:t>
-      </w:r>
-      <w:r>
-        <w:t>2026</w:t>
+        <w:t xml:space="preserve"> October 2026</w:t>
       </w:r>
     </w:p>
     <w:p>
@@ -148,7 +174,7 @@
                     <pic:cNvPicPr/>
                   </pic:nvPicPr>
                   <pic:blipFill>
-                    <a:blip r:embed="rId8"/>
+                    <a:blip r:embed="rId10"/>
                     <a:stretch>
                       <a:fillRect/>
                     </a:stretch>
@@ -883,7 +909,7 @@
                     <pic:cNvPicPr/>
                   </pic:nvPicPr>
                   <pic:blipFill>
-                    <a:blip r:embed="rId9"/>
+                    <a:blip r:embed="rId11"/>
                     <a:stretch>
                       <a:fillRect/>
                     </a:stretch>
@@ -946,7 +972,7 @@
                     <pic:cNvPicPr/>
                   </pic:nvPicPr>
                   <pic:blipFill>
-                    <a:blip r:embed="rId10"/>
+                    <a:blip r:embed="rId12"/>
                     <a:stretch>
                       <a:fillRect/>
                     </a:stretch>
@@ -1052,7 +1078,7 @@
                     <pic:cNvPicPr/>
                   </pic:nvPicPr>
                   <pic:blipFill>
-                    <a:blip r:embed="rId11"/>
+                    <a:blip r:embed="rId13"/>
                     <a:stretch>
                       <a:fillRect/>
                     </a:stretch>
@@ -1181,7 +1207,7 @@
                     <pic:cNvPicPr/>
                   </pic:nvPicPr>
                   <pic:blipFill>
-                    <a:blip r:embed="rId12"/>
+                    <a:blip r:embed="rId14"/>
                     <a:stretch>
                       <a:fillRect/>
                     </a:stretch>
@@ -2437,7 +2463,7 @@
                     <pic:cNvPicPr/>
                   </pic:nvPicPr>
                   <pic:blipFill>
-                    <a:blip r:embed="rId13"/>
+                    <a:blip r:embed="rId15"/>
                     <a:stretch>
                       <a:fillRect/>
                     </a:stretch>
@@ -2494,7 +2520,7 @@
                     <pic:cNvPicPr/>
                   </pic:nvPicPr>
                   <pic:blipFill>
-                    <a:blip r:embed="rId14"/>
+                    <a:blip r:embed="rId16"/>
                     <a:stretch>
                       <a:fillRect/>
                     </a:stretch>
@@ -2732,7 +2758,7 @@
                     <pic:cNvPicPr/>
                   </pic:nvPicPr>
                   <pic:blipFill>
-                    <a:blip r:embed="rId15"/>
+                    <a:blip r:embed="rId17"/>
                     <a:stretch>
                       <a:fillRect/>
                     </a:stretch>
@@ -2790,7 +2816,7 @@
                     <pic:cNvPicPr/>
                   </pic:nvPicPr>
                   <pic:blipFill>
-                    <a:blip r:embed="rId16"/>
+                    <a:blip r:embed="rId18"/>
                     <a:stretch>
                       <a:fillRect/>
                     </a:stretch>
@@ -3355,7 +3381,7 @@
                     <pic:cNvPicPr/>
                   </pic:nvPicPr>
                   <pic:blipFill>
-                    <a:blip r:embed="rId17"/>
+                    <a:blip r:embed="rId19"/>
                     <a:stretch>
                       <a:fillRect/>
                     </a:stretch>
@@ -3412,7 +3438,7 @@
                     <pic:cNvPicPr/>
                   </pic:nvPicPr>
                   <pic:blipFill>
-                    <a:blip r:embed="rId18"/>
+                    <a:blip r:embed="rId20"/>
                     <a:stretch>
                       <a:fillRect/>
                     </a:stretch>
@@ -3892,305 +3918,6 @@
                     <pic:cNvPicPr/>
                   </pic:nvPicPr>
                   <pic:blipFill>
-                    <a:blip r:embed="rId19"/>
-                    <a:stretch>
-                      <a:fillRect/>
-                    </a:stretch>
-                  </pic:blipFill>
-                  <pic:spPr>
-                    <a:xfrm>
-                      <a:off x="0" y="0"/>
-                      <a:ext cx="4320000" cy="2543226"/>
-                    </a:xfrm>
-                    <a:prstGeom prst="rect">
-                      <a:avLst/>
-                    </a:prstGeom>
-                  </pic:spPr>
-                </pic:pic>
-              </a:graphicData>
-            </a:graphic>
-          </wp:inline>
-        </w:drawing>
-      </w:r>
-    </w:p>
-    <w:p>
-      <w:pPr>
-        <w:jc w:val="center"/>
-      </w:pPr>
-      <w:r>
-        <w:rPr>
-          <w:i/>
-          <w:sz w:val="18"/>
-        </w:rPr>
-        <w:t>Figure 12 – Docker build, run and smoke test</w:t>
-      </w:r>
-    </w:p>
-    <w:p>
-      <w:pPr>
-        <w:pStyle w:val="Heading1"/>
-      </w:pPr>
-      <w:r>
-        <w:t>9. Production deployment (Kubernetes / Minikube)</w:t>
-      </w:r>
-    </w:p>
-    <w:p>
-      <w:r>
-        <w:t xml:space="preserve">Manifests in </w:t>
-      </w:r>
-      <w:r>
-        <w:rPr>
-          <w:rFonts w:ascii="Consolas" w:hAnsi="Consolas"/>
-          <w:color w:val="9B2C2C"/>
-          <w:sz w:val="18"/>
-        </w:rPr>
-        <w:t>k8s/</w:t>
-      </w:r>
-      <w:r>
-        <w:t xml:space="preserve"> are applied with Kustomize (</w:t>
-      </w:r>
-      <w:r>
-        <w:rPr>
-          <w:rFonts w:ascii="Consolas" w:hAnsi="Consolas"/>
-          <w:color w:val="9B2C2C"/>
-          <w:sz w:val="18"/>
-        </w:rPr>
-        <w:t>kubectl apply -k k8s/</w:t>
-      </w:r>
-      <w:r>
-        <w:t>):</w:t>
-      </w:r>
-    </w:p>
-    <w:p>
-      <w:pPr>
-        <w:pStyle w:val="ListBullet"/>
-      </w:pPr>
-      <w:r>
-        <w:rPr>
-          <w:b/>
-        </w:rPr>
-        <w:t>Namespace</w:t>
-      </w:r>
-      <w:r>
-        <w:t xml:space="preserve"> </w:t>
-      </w:r>
-      <w:r>
-        <w:rPr>
-          <w:rFonts w:ascii="Consolas" w:hAnsi="Consolas"/>
-          <w:color w:val="9B2C2C"/>
-          <w:sz w:val="18"/>
-        </w:rPr>
-        <w:t>heart-mlops</w:t>
-      </w:r>
-      <w:r>
-        <w:t>;</w:t>
-      </w:r>
-    </w:p>
-    <w:p>
-      <w:pPr>
-        <w:pStyle w:val="ListBullet"/>
-      </w:pPr>
-      <w:r>
-        <w:rPr>
-          <w:b/>
-        </w:rPr>
-        <w:t>Deployment</w:t>
-      </w:r>
-      <w:r>
-        <w:t xml:space="preserve"> – 2 replicas, rolling update with </w:t>
-      </w:r>
-      <w:r>
-        <w:rPr>
-          <w:rFonts w:ascii="Consolas" w:hAnsi="Consolas"/>
-          <w:color w:val="9B2C2C"/>
-          <w:sz w:val="18"/>
-        </w:rPr>
-        <w:t>maxUnavailable: 0</w:t>
-      </w:r>
-      <w:r>
-        <w:t xml:space="preserve">, readiness and liveness probes on </w:t>
-      </w:r>
-      <w:r>
-        <w:rPr>
-          <w:rFonts w:ascii="Consolas" w:hAnsi="Consolas"/>
-          <w:color w:val="9B2C2C"/>
-          <w:sz w:val="18"/>
-        </w:rPr>
-        <w:t>/health</w:t>
-      </w:r>
-      <w:r>
-        <w:t>, CPU/memory requests and limits, non-root security context, Prometheus scrape annotations;</w:t>
-      </w:r>
-    </w:p>
-    <w:p>
-      <w:pPr>
-        <w:pStyle w:val="ListBullet"/>
-      </w:pPr>
-      <w:r>
-        <w:rPr>
-          <w:b/>
-        </w:rPr>
-        <w:t>Service</w:t>
-      </w:r>
-      <w:r>
-        <w:t xml:space="preserve"> of type </w:t>
-      </w:r>
-      <w:r>
-        <w:rPr>
-          <w:rFonts w:ascii="Consolas" w:hAnsi="Consolas"/>
-          <w:color w:val="9B2C2C"/>
-          <w:sz w:val="18"/>
-        </w:rPr>
-        <w:t>LoadBalancer</w:t>
-      </w:r>
-      <w:r>
-        <w:t xml:space="preserve"> (external IP through </w:t>
-      </w:r>
-      <w:r>
-        <w:rPr>
-          <w:rFonts w:ascii="Consolas" w:hAnsi="Consolas"/>
-          <w:color w:val="9B2C2C"/>
-          <w:sz w:val="18"/>
-        </w:rPr>
-        <w:t>minikube tunnel</w:t>
-      </w:r>
-      <w:r>
-        <w:t>);</w:t>
-      </w:r>
-    </w:p>
-    <w:p>
-      <w:pPr>
-        <w:pStyle w:val="ListBullet"/>
-      </w:pPr>
-      <w:r>
-        <w:rPr>
-          <w:b/>
-        </w:rPr>
-        <w:t>Ingress</w:t>
-      </w:r>
-      <w:r>
-        <w:t xml:space="preserve"> (NGINX) on host </w:t>
-      </w:r>
-      <w:r>
-        <w:rPr>
-          <w:rFonts w:ascii="Consolas" w:hAnsi="Consolas"/>
-          <w:color w:val="9B2C2C"/>
-          <w:sz w:val="18"/>
-        </w:rPr>
-        <w:t>heart-api.local</w:t>
-      </w:r>
-      <w:r>
-        <w:t>;</w:t>
-      </w:r>
-    </w:p>
-    <w:p>
-      <w:pPr>
-        <w:pStyle w:val="ListBullet"/>
-      </w:pPr>
-      <w:r>
-        <w:rPr>
-          <w:b/>
-        </w:rPr>
-        <w:t>HorizontalPodAutoscaler</w:t>
-      </w:r>
-      <w:r>
-        <w:t xml:space="preserve"> 2–5 replicas at 70 % CPU.</w:t>
-      </w:r>
-    </w:p>
-    <w:p>
-      <w:r>
-        <w:rPr>
-          <w:rFonts w:ascii="Consolas" w:hAnsi="Consolas"/>
-          <w:color w:val="9B2C2C"/>
-          <w:sz w:val="18"/>
-        </w:rPr>
-        <w:t>scripts/deploy_minikube.sh</w:t>
-      </w:r>
-      <w:r>
-        <w:t xml:space="preserve"> performs the whole flow: start Minikube, enable add-ons, build and load the image, apply manifests, wait for rollout and run the smoke test against the service URL.</w:t>
-      </w:r>
-    </w:p>
-    <w:p>
-      <w:pPr>
-        <w:jc w:val="center"/>
-      </w:pPr>
-      <w:r>
-        <w:rPr>
-          <w:noProof/>
-        </w:rPr>
-        <w:drawing>
-          <wp:inline distT="0" distB="0" distL="0" distR="0" wp14:anchorId="6161A75E" wp14:editId="7A5EB25D">
-            <wp:extent cx="4320000" cy="2543226"/>
-            <wp:effectExtent l="0" t="0" r="0" b="0"/>
-            <wp:docPr id="13" name="Picture 13"/>
-            <wp:cNvGraphicFramePr>
-              <a:graphicFrameLocks xmlns:a="http://schemas.openxmlformats.org/drawingml/2006/main" noChangeAspect="1"/>
-            </wp:cNvGraphicFramePr>
-            <a:graphic xmlns:a="http://schemas.openxmlformats.org/drawingml/2006/main">
-              <a:graphicData uri="http://schemas.openxmlformats.org/drawingml/2006/picture">
-                <pic:pic xmlns:pic="http://schemas.openxmlformats.org/drawingml/2006/picture">
-                  <pic:nvPicPr>
-                    <pic:cNvPr id="0" name="09_k8s_resources.png"/>
-                    <pic:cNvPicPr/>
-                  </pic:nvPicPr>
-                  <pic:blipFill>
-                    <a:blip r:embed="rId20"/>
-                    <a:stretch>
-                      <a:fillRect/>
-                    </a:stretch>
-                  </pic:blipFill>
-                  <pic:spPr>
-                    <a:xfrm>
-                      <a:off x="0" y="0"/>
-                      <a:ext cx="4320000" cy="2543226"/>
-                    </a:xfrm>
-                    <a:prstGeom prst="rect">
-                      <a:avLst/>
-                    </a:prstGeom>
-                  </pic:spPr>
-                </pic:pic>
-              </a:graphicData>
-            </a:graphic>
-          </wp:inline>
-        </w:drawing>
-      </w:r>
-    </w:p>
-    <w:p>
-      <w:pPr>
-        <w:jc w:val="center"/>
-      </w:pPr>
-      <w:r>
-        <w:rPr>
-          <w:i/>
-          <w:sz w:val="18"/>
-        </w:rPr>
-        <w:t>Figure 13 – Kubernetes resources</w:t>
-      </w:r>
-    </w:p>
-    <w:p>
-      <w:pPr>
-        <w:jc w:val="center"/>
-      </w:pPr>
-      <w:r>
-        <w:rPr>
-          <w:noProof/>
-        </w:rPr>
-        <w:lastRenderedPageBreak/>
-        <w:drawing>
-          <wp:inline distT="0" distB="0" distL="0" distR="0" wp14:anchorId="1DED853C" wp14:editId="3C1D1468">
-            <wp:extent cx="4320000" cy="2543226"/>
-            <wp:effectExtent l="0" t="0" r="0" b="0"/>
-            <wp:docPr id="14" name="Picture 14"/>
-            <wp:cNvGraphicFramePr>
-              <a:graphicFrameLocks xmlns:a="http://schemas.openxmlformats.org/drawingml/2006/main" noChangeAspect="1"/>
-            </wp:cNvGraphicFramePr>
-            <a:graphic xmlns:a="http://schemas.openxmlformats.org/drawingml/2006/main">
-              <a:graphicData uri="http://schemas.openxmlformats.org/drawingml/2006/picture">
-                <pic:pic xmlns:pic="http://schemas.openxmlformats.org/drawingml/2006/picture">
-                  <pic:nvPicPr>
-                    <pic:cNvPr id="0" name="10_k8s_predict_ingress.png"/>
-                    <pic:cNvPicPr/>
-                  </pic:nvPicPr>
-                  <pic:blipFill>
                     <a:blip r:embed="rId21"/>
                     <a:stretch>
                       <a:fillRect/>
@@ -4221,7 +3948,7 @@
           <w:i/>
           <w:sz w:val="18"/>
         </w:rPr>
-        <w:t>Figure 14 – Prediction through the Ingress</w:t>
+        <w:t>Figure 12 – Docker build, run and smoke test</w:t>
       </w:r>
     </w:p>
     <w:p>
@@ -4229,21 +3956,12 @@
         <w:pStyle w:val="Heading1"/>
       </w:pPr>
       <w:r>
-        <w:t>10. Monitoring and logging</w:t>
+        <w:t>9. Production deployment (Kubernetes / Minikube)</w:t>
       </w:r>
     </w:p>
     <w:p>
-      <w:pPr>
-        <w:pStyle w:val="ListBullet"/>
-      </w:pPr>
-      <w:r>
-        <w:rPr>
-          <w:b/>
-        </w:rPr>
-        <w:t>Logging:</w:t>
-      </w:r>
-      <w:r>
-        <w:t xml:space="preserve"> a middleware writes one JSON line per request (request ID, method, path, status, latency, client) and one per prediction (inputs, probability, label). The request ID is returned in the </w:t>
+      <w:r>
+        <w:t xml:space="preserve">Manifests in </w:t>
       </w:r>
       <w:r>
         <w:rPr>
@@ -4251,10 +3969,10 @@
           <w:color w:val="9B2C2C"/>
           <w:sz w:val="18"/>
         </w:rPr>
-        <w:t>x-request-id</w:t>
-      </w:r>
-      <w:r>
-        <w:t xml:space="preserve"> header so a client can trace its call in </w:t>
+        <w:t>k8s/</w:t>
+      </w:r>
+      <w:r>
+        <w:t xml:space="preserve"> are applied with Kustomize (</w:t>
       </w:r>
       <w:r>
         <w:rPr>
@@ -4262,10 +3980,10 @@
           <w:color w:val="9B2C2C"/>
           <w:sz w:val="18"/>
         </w:rPr>
-        <w:t>kubectl logs</w:t>
-      </w:r>
-      <w:r>
-        <w:t>.</w:t>
+        <w:t>kubectl apply -k k8s/</w:t>
+      </w:r>
+      <w:r>
+        <w:t>):</w:t>
       </w:r>
     </w:p>
     <w:p>
@@ -4276,7 +3994,7 @@
         <w:rPr>
           <w:b/>
         </w:rPr>
-        <w:t>Metrics:</w:t>
+        <w:t>Namespace</w:t>
       </w:r>
       <w:r>
         <w:t xml:space="preserve"> </w:t>
@@ -4287,10 +4005,24 @@
           <w:color w:val="9B2C2C"/>
           <w:sz w:val="18"/>
         </w:rPr>
-        <w:t>heart_api_requests_total{method,path,status}</w:t>
-      </w:r>
-      <w:r>
-        <w:t xml:space="preserve">, </w:t>
+        <w:t>heart-mlops</w:t>
+      </w:r>
+      <w:r>
+        <w:t>;</w:t>
+      </w:r>
+    </w:p>
+    <w:p>
+      <w:pPr>
+        <w:pStyle w:val="ListBullet"/>
+      </w:pPr>
+      <w:r>
+        <w:rPr>
+          <w:b/>
+        </w:rPr>
+        <w:t>Deployment</w:t>
+      </w:r>
+      <w:r>
+        <w:t xml:space="preserve"> – 2 replicas, rolling update with </w:t>
       </w:r>
       <w:r>
         <w:rPr>
@@ -4298,10 +4030,10 @@
           <w:color w:val="9B2C2C"/>
           <w:sz w:val="18"/>
         </w:rPr>
-        <w:t>heart_api_request_latency_seconds</w:t>
-      </w:r>
-      <w:r>
-        <w:t xml:space="preserve"> (histogram), </w:t>
+        <w:t>maxUnavailable: 0</w:t>
+      </w:r>
+      <w:r>
+        <w:t xml:space="preserve">, readiness and liveness probes on </w:t>
       </w:r>
       <w:r>
         <w:rPr>
@@ -4309,10 +4041,24 @@
           <w:color w:val="9B2C2C"/>
           <w:sz w:val="18"/>
         </w:rPr>
-        <w:t>heart_api_predictions_total{label}</w:t>
-      </w:r>
-      <w:r>
-        <w:t xml:space="preserve">, </w:t>
+        <w:t>/health</w:t>
+      </w:r>
+      <w:r>
+        <w:t>, CPU/memory requests and limits, non-root security context, Prometheus scrape annotations;</w:t>
+      </w:r>
+    </w:p>
+    <w:p>
+      <w:pPr>
+        <w:pStyle w:val="ListBullet"/>
+      </w:pPr>
+      <w:r>
+        <w:rPr>
+          <w:b/>
+        </w:rPr>
+        <w:t>Service</w:t>
+      </w:r>
+      <w:r>
+        <w:t xml:space="preserve"> of type </w:t>
       </w:r>
       <w:r>
         <w:rPr>
@@ -4320,10 +4066,10 @@
           <w:color w:val="9B2C2C"/>
           <w:sz w:val="18"/>
         </w:rPr>
-        <w:t>heart_api_disease_probability</w:t>
-      </w:r>
-      <w:r>
-        <w:t xml:space="preserve"> (histogram) and </w:t>
+        <w:t>LoadBalancer</w:t>
+      </w:r>
+      <w:r>
+        <w:t xml:space="preserve"> (external IP through </w:t>
       </w:r>
       <w:r>
         <w:rPr>
@@ -4331,10 +4077,10 @@
           <w:color w:val="9B2C2C"/>
           <w:sz w:val="18"/>
         </w:rPr>
-        <w:t>heart_api_model_info{version}</w:t>
-      </w:r>
-      <w:r>
-        <w:t>.</w:t>
+        <w:t>minikube tunnel</w:t>
+      </w:r>
+      <w:r>
+        <w:t>);</w:t>
       </w:r>
     </w:p>
     <w:p>
@@ -4345,10 +4091,10 @@
         <w:rPr>
           <w:b/>
         </w:rPr>
-        <w:t>Prometheus</w:t>
-      </w:r>
-      <w:r>
-        <w:t xml:space="preserve"> discovers the API pods through their annotations (pod service discovery with RBAC); for local use, </w:t>
+        <w:t>Ingress</w:t>
+      </w:r>
+      <w:r>
+        <w:t xml:space="preserve"> (NGINX) on host </w:t>
       </w:r>
       <w:r>
         <w:rPr>
@@ -4356,10 +4102,10 @@
           <w:color w:val="9B2C2C"/>
           <w:sz w:val="18"/>
         </w:rPr>
-        <w:t>docker-compose.yml</w:t>
-      </w:r>
-      <w:r>
-        <w:t xml:space="preserve"> runs the same stack.</w:t>
+        <w:t>heart-api.local</w:t>
+      </w:r>
+      <w:r>
+        <w:t>;</w:t>
       </w:r>
     </w:p>
     <w:p>
@@ -4370,10 +4116,23 @@
         <w:rPr>
           <w:b/>
         </w:rPr>
-        <w:t>Grafana</w:t>
-      </w:r>
-      <w:r>
-        <w:t xml:space="preserve"> is provisioned automatically with a dashboard showing total predictions, request rate, p95 latency, error rate, latency percentiles, predictions per class, and the mean predicted probability as a simple drift signal — a sustained shift in that line means the incoming patient mix has changed and the model should be reviewed.</w:t>
+        <w:t>HorizontalPodAutoscaler</w:t>
+      </w:r>
+      <w:r>
+        <w:t xml:space="preserve"> 2–5 replicas at 70 % CPU.</w:t>
+      </w:r>
+    </w:p>
+    <w:p>
+      <w:r>
+        <w:rPr>
+          <w:rFonts w:ascii="Consolas" w:hAnsi="Consolas"/>
+          <w:color w:val="9B2C2C"/>
+          <w:sz w:val="18"/>
+        </w:rPr>
+        <w:t>scripts/deploy_minikube.sh</w:t>
+      </w:r>
+      <w:r>
+        <w:t xml:space="preserve"> performs the whole flow: start Minikube, enable add-ons, build and load the image, apply manifests, wait for rollout and run the smoke test against the service URL.</w:t>
       </w:r>
     </w:p>
     <w:p>
@@ -4385,10 +4144,10 @@
           <w:noProof/>
         </w:rPr>
         <w:drawing>
-          <wp:inline distT="0" distB="0" distL="0" distR="0" wp14:anchorId="42A4A9CE" wp14:editId="42131D60">
+          <wp:inline distT="0" distB="0" distL="0" distR="0" wp14:anchorId="6161A75E" wp14:editId="7A5EB25D">
             <wp:extent cx="4320000" cy="2543226"/>
             <wp:effectExtent l="0" t="0" r="0" b="0"/>
-            <wp:docPr id="15" name="Picture 15"/>
+            <wp:docPr id="13" name="Picture 13"/>
             <wp:cNvGraphicFramePr>
               <a:graphicFrameLocks xmlns:a="http://schemas.openxmlformats.org/drawingml/2006/main" noChangeAspect="1"/>
             </wp:cNvGraphicFramePr>
@@ -4396,7 +4155,7 @@
               <a:graphicData uri="http://schemas.openxmlformats.org/drawingml/2006/picture">
                 <pic:pic xmlns:pic="http://schemas.openxmlformats.org/drawingml/2006/picture">
                   <pic:nvPicPr>
-                    <pic:cNvPr id="0" name="12_grafana_dashboard.png"/>
+                    <pic:cNvPr id="0" name="09_k8s_resources.png"/>
                     <pic:cNvPicPr/>
                   </pic:nvPicPr>
                   <pic:blipFill>
@@ -4430,6 +4189,273 @@
           <w:i/>
           <w:sz w:val="18"/>
         </w:rPr>
+        <w:t>Figure 13 – Kubernetes resources</w:t>
+      </w:r>
+    </w:p>
+    <w:p>
+      <w:pPr>
+        <w:jc w:val="center"/>
+      </w:pPr>
+      <w:r>
+        <w:rPr>
+          <w:noProof/>
+        </w:rPr>
+        <w:lastRenderedPageBreak/>
+        <w:drawing>
+          <wp:inline distT="0" distB="0" distL="0" distR="0" wp14:anchorId="1DED853C" wp14:editId="3C1D1468">
+            <wp:extent cx="4320000" cy="2543226"/>
+            <wp:effectExtent l="0" t="0" r="0" b="0"/>
+            <wp:docPr id="14" name="Picture 14"/>
+            <wp:cNvGraphicFramePr>
+              <a:graphicFrameLocks xmlns:a="http://schemas.openxmlformats.org/drawingml/2006/main" noChangeAspect="1"/>
+            </wp:cNvGraphicFramePr>
+            <a:graphic xmlns:a="http://schemas.openxmlformats.org/drawingml/2006/main">
+              <a:graphicData uri="http://schemas.openxmlformats.org/drawingml/2006/picture">
+                <pic:pic xmlns:pic="http://schemas.openxmlformats.org/drawingml/2006/picture">
+                  <pic:nvPicPr>
+                    <pic:cNvPr id="0" name="10_k8s_predict_ingress.png"/>
+                    <pic:cNvPicPr/>
+                  </pic:nvPicPr>
+                  <pic:blipFill>
+                    <a:blip r:embed="rId23"/>
+                    <a:stretch>
+                      <a:fillRect/>
+                    </a:stretch>
+                  </pic:blipFill>
+                  <pic:spPr>
+                    <a:xfrm>
+                      <a:off x="0" y="0"/>
+                      <a:ext cx="4320000" cy="2543226"/>
+                    </a:xfrm>
+                    <a:prstGeom prst="rect">
+                      <a:avLst/>
+                    </a:prstGeom>
+                  </pic:spPr>
+                </pic:pic>
+              </a:graphicData>
+            </a:graphic>
+          </wp:inline>
+        </w:drawing>
+      </w:r>
+    </w:p>
+    <w:p>
+      <w:pPr>
+        <w:jc w:val="center"/>
+      </w:pPr>
+      <w:r>
+        <w:rPr>
+          <w:i/>
+          <w:sz w:val="18"/>
+        </w:rPr>
+        <w:t>Figure 14 – Prediction through the Ingress</w:t>
+      </w:r>
+    </w:p>
+    <w:p>
+      <w:pPr>
+        <w:pStyle w:val="Heading1"/>
+      </w:pPr>
+      <w:r>
+        <w:t>10. Monitoring and logging</w:t>
+      </w:r>
+    </w:p>
+    <w:p>
+      <w:pPr>
+        <w:pStyle w:val="ListBullet"/>
+      </w:pPr>
+      <w:r>
+        <w:rPr>
+          <w:b/>
+        </w:rPr>
+        <w:t>Logging:</w:t>
+      </w:r>
+      <w:r>
+        <w:t xml:space="preserve"> a middleware writes one JSON line per request (request ID, method, path, status, latency, client) and one per prediction (inputs, probability, label). The request ID is returned in the </w:t>
+      </w:r>
+      <w:r>
+        <w:rPr>
+          <w:rFonts w:ascii="Consolas" w:hAnsi="Consolas"/>
+          <w:color w:val="9B2C2C"/>
+          <w:sz w:val="18"/>
+        </w:rPr>
+        <w:t>x-request-id</w:t>
+      </w:r>
+      <w:r>
+        <w:t xml:space="preserve"> header so a client can trace its call in </w:t>
+      </w:r>
+      <w:r>
+        <w:rPr>
+          <w:rFonts w:ascii="Consolas" w:hAnsi="Consolas"/>
+          <w:color w:val="9B2C2C"/>
+          <w:sz w:val="18"/>
+        </w:rPr>
+        <w:t>kubectl logs</w:t>
+      </w:r>
+      <w:r>
+        <w:t>.</w:t>
+      </w:r>
+    </w:p>
+    <w:p>
+      <w:pPr>
+        <w:pStyle w:val="ListBullet"/>
+      </w:pPr>
+      <w:r>
+        <w:rPr>
+          <w:b/>
+        </w:rPr>
+        <w:t>Metrics:</w:t>
+      </w:r>
+      <w:r>
+        <w:t xml:space="preserve"> </w:t>
+      </w:r>
+      <w:r>
+        <w:rPr>
+          <w:rFonts w:ascii="Consolas" w:hAnsi="Consolas"/>
+          <w:color w:val="9B2C2C"/>
+          <w:sz w:val="18"/>
+        </w:rPr>
+        <w:t>heart_api_requests_total{method,path,status}</w:t>
+      </w:r>
+      <w:r>
+        <w:t xml:space="preserve">, </w:t>
+      </w:r>
+      <w:r>
+        <w:rPr>
+          <w:rFonts w:ascii="Consolas" w:hAnsi="Consolas"/>
+          <w:color w:val="9B2C2C"/>
+          <w:sz w:val="18"/>
+        </w:rPr>
+        <w:t>heart_api_request_latency_seconds</w:t>
+      </w:r>
+      <w:r>
+        <w:t xml:space="preserve"> (histogram), </w:t>
+      </w:r>
+      <w:r>
+        <w:rPr>
+          <w:rFonts w:ascii="Consolas" w:hAnsi="Consolas"/>
+          <w:color w:val="9B2C2C"/>
+          <w:sz w:val="18"/>
+        </w:rPr>
+        <w:t>heart_api_predictions_total{label}</w:t>
+      </w:r>
+      <w:r>
+        <w:t xml:space="preserve">, </w:t>
+      </w:r>
+      <w:r>
+        <w:rPr>
+          <w:rFonts w:ascii="Consolas" w:hAnsi="Consolas"/>
+          <w:color w:val="9B2C2C"/>
+          <w:sz w:val="18"/>
+        </w:rPr>
+        <w:t>heart_api_disease_probability</w:t>
+      </w:r>
+      <w:r>
+        <w:t xml:space="preserve"> (histogram) and </w:t>
+      </w:r>
+      <w:r>
+        <w:rPr>
+          <w:rFonts w:ascii="Consolas" w:hAnsi="Consolas"/>
+          <w:color w:val="9B2C2C"/>
+          <w:sz w:val="18"/>
+        </w:rPr>
+        <w:t>heart_api_model_info{version}</w:t>
+      </w:r>
+      <w:r>
+        <w:t>.</w:t>
+      </w:r>
+    </w:p>
+    <w:p>
+      <w:pPr>
+        <w:pStyle w:val="ListBullet"/>
+      </w:pPr>
+      <w:r>
+        <w:rPr>
+          <w:b/>
+        </w:rPr>
+        <w:t>Prometheus</w:t>
+      </w:r>
+      <w:r>
+        <w:t xml:space="preserve"> discovers the API pods through their annotations (pod service discovery with RBAC); for local use, </w:t>
+      </w:r>
+      <w:r>
+        <w:rPr>
+          <w:rFonts w:ascii="Consolas" w:hAnsi="Consolas"/>
+          <w:color w:val="9B2C2C"/>
+          <w:sz w:val="18"/>
+        </w:rPr>
+        <w:t>docker-compose.yml</w:t>
+      </w:r>
+      <w:r>
+        <w:t xml:space="preserve"> runs the same stack.</w:t>
+      </w:r>
+    </w:p>
+    <w:p>
+      <w:pPr>
+        <w:pStyle w:val="ListBullet"/>
+      </w:pPr>
+      <w:r>
+        <w:rPr>
+          <w:b/>
+        </w:rPr>
+        <w:t>Grafana</w:t>
+      </w:r>
+      <w:r>
+        <w:t xml:space="preserve"> is provisioned automatically with a dashboard showing total predictions, request rate, p95 latency, error rate, latency percentiles, predictions per class, and the mean predicted probability as a simple drift signal — a sustained shift in that line means the incoming patient mix has changed and the model should be reviewed.</w:t>
+      </w:r>
+    </w:p>
+    <w:p>
+      <w:pPr>
+        <w:jc w:val="center"/>
+      </w:pPr>
+      <w:r>
+        <w:rPr>
+          <w:noProof/>
+        </w:rPr>
+        <w:drawing>
+          <wp:inline distT="0" distB="0" distL="0" distR="0" wp14:anchorId="42A4A9CE" wp14:editId="42131D60">
+            <wp:extent cx="4320000" cy="2543226"/>
+            <wp:effectExtent l="0" t="0" r="0" b="0"/>
+            <wp:docPr id="15" name="Picture 15"/>
+            <wp:cNvGraphicFramePr>
+              <a:graphicFrameLocks xmlns:a="http://schemas.openxmlformats.org/drawingml/2006/main" noChangeAspect="1"/>
+            </wp:cNvGraphicFramePr>
+            <a:graphic xmlns:a="http://schemas.openxmlformats.org/drawingml/2006/main">
+              <a:graphicData uri="http://schemas.openxmlformats.org/drawingml/2006/picture">
+                <pic:pic xmlns:pic="http://schemas.openxmlformats.org/drawingml/2006/picture">
+                  <pic:nvPicPr>
+                    <pic:cNvPr id="0" name="12_grafana_dashboard.png"/>
+                    <pic:cNvPicPr/>
+                  </pic:nvPicPr>
+                  <pic:blipFill>
+                    <a:blip r:embed="rId24"/>
+                    <a:stretch>
+                      <a:fillRect/>
+                    </a:stretch>
+                  </pic:blipFill>
+                  <pic:spPr>
+                    <a:xfrm>
+                      <a:off x="0" y="0"/>
+                      <a:ext cx="4320000" cy="2543226"/>
+                    </a:xfrm>
+                    <a:prstGeom prst="rect">
+                      <a:avLst/>
+                    </a:prstGeom>
+                  </pic:spPr>
+                </pic:pic>
+              </a:graphicData>
+            </a:graphic>
+          </wp:inline>
+        </w:drawing>
+      </w:r>
+    </w:p>
+    <w:p>
+      <w:pPr>
+        <w:jc w:val="center"/>
+      </w:pPr>
+      <w:r>
+        <w:rPr>
+          <w:i/>
+          <w:sz w:val="18"/>
+        </w:rPr>
         <w:t>Figure 15 – Grafana dashboard under load</w:t>
       </w:r>
     </w:p>
@@ -4460,10 +4486,7 @@
     </w:p>
     <w:p>
       <w:r>
-        <w:t>The three changes I made are an age × ST-depression feature in place of cholesterol-per-age, a fixed recall-oriented threshold used in both evaluation and serving, and a recall gate alongside the existing AUC gate in CI. The feature is still experimental, and lower thresholds can increase false positives. I would next check probability calibration, validate the model and threshold on new data, and add data-drift checks and a model-promotion workflow. The existing deployment and monitoring setup provides a p</w:t>
-      </w:r>
-      <w:r>
-        <w:t>lace to apply those checks; it does not remove the need for validation.</w:t>
+        <w:t>The three changes I made are an age × ST-depression feature in place of cholesterol-per-age, a fixed recall-oriented threshold used in both evaluation and serving, and a recall gate alongside the existing AUC gate in CI. The feature is still experimental, and lower thresholds can increase false positives. I would next check probability calibration, validate the model and threshold on new data, and add data-drift checks and a model-promotion workflow. The existing deployment and monitoring setup provides a place to apply those checks; it does not remove the need for validation.</w:t>
       </w:r>
     </w:p>
     <w:p>
@@ -4534,16 +4557,12 @@
       <w:r>
         <w:t xml:space="preserve">Demo video: </w:t>
       </w:r>
-      <w:hyperlink r:id="rId23" w:history="1">
+      <w:hyperlink r:id="rId25" w:tooltip="Original URL:&#10;https://protect.checkpoint.com/v2/r01/___https://drive.google.com/drive/folders/1_9y0KQ9w0-fGpS1RQlmcoIgg9FUK5-L7___.YzJ1OmV2b2tldGVjaG5vbG9naWVzMTpjOm86M2Y2NTc3OGNhYzQ2ZmY4Mzg5YmNjYjBiNjNkZDQ2MWQ6Nzo5OGE0OmExNGVhYTZjMDc2ZTZkYmZhNDJjZTA5NDQ3ZGJhNjJlYWI3NmNiZGYwMzRiNjhjOWQ4NjY5MGIxZGE4NDI5M2M6aDpUOkY&#10;&#10;Click to follow link." w:history="1">
         <w:r>
           <w:rPr>
-            <w:rFonts w:ascii="Times New Roman" w:eastAsia="Times New Roman" w:hAnsi="Times New Roman" w:cs="Times New Roman"/>
-            <w:color w:val="0000FF"/>
-            <w:sz w:val="24"/>
-            <w:szCs w:val="24"/>
-            <w:u w:val="single"/>
+            <w:rStyle w:val="Hyperlink"/>
           </w:rPr>
-          <w:t>https://drive.google.com/file/d/18hIQTMo7kfGTvx...</w:t>
+          <w:t>3rd_sem_MLOps - Google Drive</w:t>
         </w:r>
       </w:hyperlink>
     </w:p>
@@ -4557,7 +4576,7 @@
       </w:pPr>
     </w:p>
     <w:sectPr>
-      <w:footerReference w:type="default" r:id="rId24"/>
+      <w:footerReference w:type="default" r:id="rId26"/>
       <w:pgSz w:w="11906" w:h="16838"/>
       <w:pgMar w:top="1134" w:right="1247" w:bottom="1134" w:left="1247" w:header="720" w:footer="720" w:gutter="0"/>
       <w:cols w:space="720"/>

</xml_diff>

<commit_message>
updated the report with latest video recording
</commit_message>
<xml_diff>
--- a/reports/Heart_Disease_MLOps_Report.docx
+++ b/reports/Heart_Disease_MLOps_Report.docx
@@ -87,15 +87,15 @@
         </w:rPr>
       </w:pPr>
       <w:r>
-        <w:t xml:space="preserve">  </w:t>
-      </w:r>
-      <w:r>
-        <w:t xml:space="preserve">Demo video: </w:t>
-      </w:r>
-      <w:hyperlink r:id="rId9" w:tooltip="Original URL:&#10;https://protect.checkpoint.com/v2/r01/___https://drive.google.com/drive/folders/1_9y0KQ9w0-fGpS1RQlmcoIgg9FUK5-L7___.YzJ1OmV2b2tldGVjaG5vbG9naWVzMTpjOm86M2Y2NTc3OGNhYzQ2ZmY4Mzg5YmNjYjBiNjNkZDQ2MWQ6Nzo5OGE0OmExNGVhYTZjMDc2ZTZkYmZhNDJjZTA5NDQ3ZGJhNjJlYWI3NmNiZGYwMzRiNjhjOWQ4NjY5MGIxZGE4NDI5M2M6aDpUOkY&#10;&#10;Click to follow link." w:history="1">
+        <w:t xml:space="preserve">  Demo video: </w:t>
+      </w:r>
+      <w:hyperlink r:id="rId9" w:tooltip="Original URL:&#10;https://protect.checkpoint.com/v2/r01/___https://drive.google.com/drive/folders/1_9y0KQ9w0-fGpS1RQlmcoIgg9FUK5-L7___.YzJ1OmV2b2tldGVjaG5vbG9naWVzMTpjOm86ZjE1NDQwYzNkNjFiMzFlMWFkMTM0MTVmMjRlYTJlNjQ6Nzo2ZWI3OmRkYjdkYTVkOGRiZGFlNmUxYzNkMTJlMTNlMmQ5YjNjMWJjYzBjYzhiNzRkN2EwMGI2MmI5NjEwZGE2NjU4MmI6aDpUOkY&#10;&#10;Click to follow link." w:history="1">
         <w:r>
           <w:rPr>
             <w:rStyle w:val="Hyperlink"/>
+            <w:rFonts w:ascii="Aptos" w:hAnsi="Aptos"/>
+            <w:color w:val="0086F0"/>
+            <w:shd w:val="clear" w:color="auto" w:fill="FFFFFF"/>
           </w:rPr>
           <w:t>3rd_sem_MLOps - Google Drive</w:t>
         </w:r>
@@ -4557,10 +4557,13 @@
       <w:r>
         <w:t xml:space="preserve">Demo video: </w:t>
       </w:r>
-      <w:hyperlink r:id="rId25" w:tooltip="Original URL:&#10;https://protect.checkpoint.com/v2/r01/___https://drive.google.com/drive/folders/1_9y0KQ9w0-fGpS1RQlmcoIgg9FUK5-L7___.YzJ1OmV2b2tldGVjaG5vbG9naWVzMTpjOm86M2Y2NTc3OGNhYzQ2ZmY4Mzg5YmNjYjBiNjNkZDQ2MWQ6Nzo5OGE0OmExNGVhYTZjMDc2ZTZkYmZhNDJjZTA5NDQ3ZGJhNjJlYWI3NmNiZGYwMzRiNjhjOWQ4NjY5MGIxZGE4NDI5M2M6aDpUOkY&#10;&#10;Click to follow link." w:history="1">
+      <w:hyperlink r:id="rId25" w:tooltip="Original URL:&#10;https://protect.checkpoint.com/v2/r01/___https://drive.google.com/drive/folders/1_9y0KQ9w0-fGpS1RQlmcoIgg9FUK5-L7___.YzJ1OmV2b2tldGVjaG5vbG9naWVzMTpjOm86ZjE1NDQwYzNkNjFiMzFlMWFkMTM0MTVmMjRlYTJlNjQ6Nzo2ZWI3OmRkYjdkYTVkOGRiZGFlNmUxYzNkMTJlMTNlMmQ5YjNjMWJjYzBjYzhiNzRkN2EwMGI2MmI5NjEwZGE2NjU4MmI6aDpUOkY&#10;&#10;Click to follow link." w:history="1">
         <w:r>
           <w:rPr>
             <w:rStyle w:val="Hyperlink"/>
+            <w:rFonts w:ascii="Aptos" w:hAnsi="Aptos"/>
+            <w:color w:val="0086F0"/>
+            <w:shd w:val="clear" w:color="auto" w:fill="FFFFFF"/>
           </w:rPr>
           <w:t>3rd_sem_MLOps - Google Drive</w:t>
         </w:r>

</xml_diff>

<commit_message>
updated the video link to correct path
</commit_message>
<xml_diff>
--- a/reports/Heart_Disease_MLOps_Report.docx
+++ b/reports/Heart_Disease_MLOps_Report.docx
@@ -81,15 +81,13 @@
       <w:pPr>
         <w:ind w:left="1440" w:firstLine="720"/>
         <w:rPr>
-          <w:rFonts w:ascii="Times New Roman" w:eastAsia="Times New Roman" w:hAnsi="Times New Roman" w:cs="Times New Roman"/>
-          <w:sz w:val="24"/>
-          <w:szCs w:val="24"/>
+          <w:color w:val="1D4E89"/>
         </w:rPr>
       </w:pPr>
       <w:r>
-        <w:t xml:space="preserve">  Demo video: </w:t>
-      </w:r>
-      <w:hyperlink r:id="rId9" w:tooltip="Original URL:&#10;https://protect.checkpoint.com/v2/r01/___https://drive.google.com/drive/folders/1_9y0KQ9w0-fGpS1RQlmcoIgg9FUK5-L7___.YzJ1OmV2b2tldGVjaG5vbG9naWVzMTpjOm86ZjE1NDQwYzNkNjFiMzFlMWFkMTM0MTVmMjRlYTJlNjQ6Nzo2ZWI3OmRkYjdkYTVkOGRiZGFlNmUxYzNkMTJlMTNlMmQ5YjNjMWJjYzBjYzhiNzRkN2EwMGI2MmI5NjEwZGE2NjU4MmI6aDpUOkY&#10;&#10;Click to follow link." w:history="1">
+        <w:t xml:space="preserve">Demo video: </w:t>
+      </w:r>
+      <w:hyperlink r:id="rId9" w:tooltip="Original URL:&#10;https://protect.checkpoint.com/v2/r01/___https://drive.google.com/file/d/15_WoYrqAlzIUS5t9lskq1eSMoEkHEE03/view?usp=drive_link___.YzJ1OmV2b2tldGVjaG5vbG9naWVzMTpjOm86Yjg0NzRmZDJkYmYwOTg3MWFjMmY4MTc3YmRjODFkMDU6NzoxMWQxOjVlYmE4NmNhYWM0NmU3MTdjNjEzODUyNTk3NTEwMGIxNjhiZmM2ZjEwODY3MzJlOGNjOTg2NzE3OWZhZWE2ZmE6aDpUOkY&#10;&#10;Click to follow link." w:history="1">
         <w:r>
           <w:rPr>
             <w:rStyle w:val="Hyperlink"/>
@@ -97,7 +95,7 @@
             <w:color w:val="0086F0"/>
             <w:shd w:val="clear" w:color="auto" w:fill="FFFFFF"/>
           </w:rPr>
-          <w:t>3rd_sem_MLOps - Google Drive</w:t>
+          <w:t>https://drive.google.com/file/d/15_WoYrqAlzIUS5t9lskq1eSMoEkHEE03/view?usp=drive_link</w:t>
         </w:r>
       </w:hyperlink>
     </w:p>
@@ -4557,7 +4555,7 @@
       <w:r>
         <w:t xml:space="preserve">Demo video: </w:t>
       </w:r>
-      <w:hyperlink r:id="rId25" w:tooltip="Original URL:&#10;https://protect.checkpoint.com/v2/r01/___https://drive.google.com/drive/folders/1_9y0KQ9w0-fGpS1RQlmcoIgg9FUK5-L7___.YzJ1OmV2b2tldGVjaG5vbG9naWVzMTpjOm86ZjE1NDQwYzNkNjFiMzFlMWFkMTM0MTVmMjRlYTJlNjQ6Nzo2ZWI3OmRkYjdkYTVkOGRiZGFlNmUxYzNkMTJlMTNlMmQ5YjNjMWJjYzBjYzhiNzRkN2EwMGI2MmI5NjEwZGE2NjU4MmI6aDpUOkY&#10;&#10;Click to follow link." w:history="1">
+      <w:hyperlink r:id="rId25" w:tooltip="Original URL:&#10;https://protect.checkpoint.com/v2/r01/___https://drive.google.com/file/d/15_WoYrqAlzIUS5t9lskq1eSMoEkHEE03/view?usp=drive_link___.YzJ1OmV2b2tldGVjaG5vbG9naWVzMTpjOm86Yjg0NzRmZDJkYmYwOTg3MWFjMmY4MTc3YmRjODFkMDU6NzoxMWQxOjVlYmE4NmNhYWM0NmU3MTdjNjEzODUyNTk3NTEwMGIxNjhiZmM2ZjEwODY3MzJlOGNjOTg2NzE3OWZhZWE2ZmE6aDpUOkY&#10;&#10;Click to follow link." w:history="1">
         <w:r>
           <w:rPr>
             <w:rStyle w:val="Hyperlink"/>
@@ -4565,7 +4563,7 @@
             <w:color w:val="0086F0"/>
             <w:shd w:val="clear" w:color="auto" w:fill="FFFFFF"/>
           </w:rPr>
-          <w:t>3rd_sem_MLOps - Google Drive</w:t>
+          <w:t>https://drive.google.com/file/d/15_WoYrqAlzIUS5t9lskq1eSMoEkHEE03/view?usp=drive_link</w:t>
         </w:r>
       </w:hyperlink>
     </w:p>

</xml_diff>